<commit_message>
Update editable Word CV with new profile and expanded experience
Co-Authored-By: Claude Sonnet 5.5 <noreply@anthropic.com>
Claude-Session: https://claude.ai/code/session_012Ed6hShCm7LHKjxkHPPGCy
</commit_message>
<xml_diff>
--- a/CV_Diego_Paolucci_Hilti_EN.docx
+++ b/CV_Diego_Paolucci_Hilti_EN.docx
@@ -521,26 +521,7 @@
                 <w:sz w:val="16"/>
                 <w:szCs w:val="16"/>
               </w:rPr>
-              <w:t xml:space="preserve">HubSpot</w:t>
-            </w:r>
-          </w:p>
-          <w:p>
-            <w:pPr>
-              <w:pStyle w:val="ListParagraph"/>
-              <w:numPr>
-                <w:ilvl w:val="0"/>
-                <w:numId w:val="2"/>
-              </w:numPr>
-              <w:spacing w:after="15"/>
-            </w:pPr>
-            <w:r>
-              <w:rPr>
-                <w:rFonts w:ascii="Arial" w:cs="Arial" w:eastAsia="Arial" w:hAnsi="Arial"/>
-                <w:color w:val="1F2933"/>
-                <w:sz w:val="16"/>
-                <w:szCs w:val="16"/>
-              </w:rPr>
-              <w:t xml:space="preserve">Loyalty Programs</w:t>
+              <w:t xml:space="preserve">HubSpot &amp; Marketing Automation</w:t>
             </w:r>
           </w:p>
           <w:p>
@@ -959,7 +940,7 @@
                 <w:sz w:val="17"/>
                 <w:szCs w:val="17"/>
               </w:rPr>
-              <w:t xml:space="preserve">Most growth is not lost in strategy. It is lost between a lead and a follow-up, between a campaign and a counter, between a loyalty program and the person who has to explain it. For 12+ years across LATAM and the Caribbean I have worked in that gap.</w:t>
+              <w:t xml:space="preserve">Business development, marketing and sales professional with 12+ years across LATAM and the Caribbean, in both corporate and entrepreneurial settings. I have sold, built markets and delivered strategy for brands in Apparel, Automotive, Hospitality, Spirits, Consumer Goods and startups, from IBM and First Data / MasterCard to the agencies and ventures I founded. That range lets me adapt quickly to a new business, industry or culture.</w:t>
             </w:r>
           </w:p>
           <w:p>
@@ -973,7 +954,7 @@
                 <w:sz w:val="17"/>
                 <w:szCs w:val="17"/>
               </w:rPr>
-              <w:t xml:space="preserve">My background is in marketing: growth, digital and brand activation for international brands (KLM-Air France, Under Armour, Mattel, Converse, PayPal, Sony) and for small and mid-sized businesses that need to grow with limited resources. I have built loyalty programs with 450,000+ daily active users, segment audiences and build communication and content verticals for each, run inbound and account-based marketing, and measured results with NPS and brand lift.</w:t>
+              <w:t xml:space="preserve">My strength is where marketing and sales meet. I define the strategy and segmentation, build the campaigns and content that generate demand, and then work shoulder to shoulder with sellers, store teams, key account managers and distributors: shaping the lead-to-close process, the follow-up routines and the tools (HubSpot, e-commerce, online ordering) that turn demand into orders.</w:t>
             </w:r>
           </w:p>
           <w:p>
@@ -987,7 +968,7 @@
                 <w:sz w:val="17"/>
                 <w:szCs w:val="17"/>
               </w:rPr>
-              <w:t xml:space="preserve">What sets me apart is what happens after the campaign. I work alongside sales teams: designing the lead-to-close process, building follow-up routines by call, email and proposal, implementing HubSpot and e-commerce, and training sellers, store teams and key account managers so strategy turns into follow-up and orders. I started in software sales at IBM and have sold throughout my career, from card issuing at First Data to the agencies I founded, so I understand both a multinational's structure and a small customer's urgency.</w:t>
+              <w:t xml:space="preserve">Hands-on in digital marketing, events, business development and project management, I run data-driven campaigns end to end and deliver measurable results: leads +20% and SQLs +15% in a B2B account-based program, and +25% customer engagement for a restaurant group. I manage stakeholders, lead cross-functional teams and build lasting relationships. I now want to apply all of it inside a company like Hilti, learning its culture and growing with it.</w:t>
             </w:r>
           </w:p>
           <w:p>
@@ -1004,258 +985,6 @@
                 <w:szCs w:val="17"/>
               </w:rPr>
               <w:t xml:space="preserve">Commercial instincts. Marketing rigor. Regional fluency.</w:t>
-            </w:r>
-          </w:p>
-          <w:p>
-            <w:pPr>
-              <w:keepNext/>
-              <w:pBdr>
-                <w:bottom w:val="single" w:color="29A8E0" w:sz="12" w:space="2"/>
-              </w:pBdr>
-              <w:spacing w:after="80" w:before="140"/>
-            </w:pPr>
-            <w:r>
-              <w:rPr>
-                <w:rFonts w:ascii="Arial" w:cs="Arial" w:eastAsia="Arial" w:hAnsi="Arial"/>
-                <w:b/>
-                <w:bCs/>
-                <w:color w:val="0B2A5B"/>
-                <w:spacing w:val="40"/>
-                <w:sz w:val="15"/>
-                <w:szCs w:val="15"/>
-              </w:rPr>
-              <w:t xml:space="preserve">THE CUSTOMER JOURNEY IN FOUR MOVES</w:t>
-            </w:r>
-          </w:p>
-          <w:tbl>
-            <w:tblPr>
-              <w:tblW w:type="dxa" w:w="7300"/>
-              <w:tblBorders>
-                <w:top w:val="single" w:color="auto" w:sz="4"/>
-                <w:left w:val="single" w:color="auto" w:sz="4"/>
-                <w:bottom w:val="single" w:color="auto" w:sz="4"/>
-                <w:right w:val="single" w:color="auto" w:sz="4"/>
-                <w:insideH w:val="single" w:color="auto" w:sz="4"/>
-                <w:insideV w:val="single" w:color="auto" w:sz="4"/>
-              </w:tblBorders>
-            </w:tblPr>
-            <w:tblGrid>
-              <w:gridCol w:w="1825"/>
-              <w:gridCol w:w="1825"/>
-              <w:gridCol w:w="1825"/>
-              <w:gridCol w:w="1825"/>
-            </w:tblGrid>
-            <w:tr>
-              <w:tc>
-                <w:tcPr>
-                  <w:tcW w:type="dxa" w:w="1825"/>
-                  <w:tcBorders>
-                    <w:top w:val="single" w:color="29A8E0" w:sz="18"/>
-                    <w:left w:val="none" w:color="FFFFFF" w:sz="0"/>
-                    <w:bottom w:val="none" w:color="FFFFFF" w:sz="0"/>
-                    <w:right w:val="single" w:color="FFFFFF" w:sz="6"/>
-                  </w:tcBorders>
-                  <w:shd w:fill="FBFBFB" w:color="auto" w:val="clear"/>
-                  <w:tcMar>
-                    <w:top w:type="dxa" w:w="60"/>
-                    <w:left w:type="dxa" w:w="80"/>
-                    <w:bottom w:type="dxa" w:w="60"/>
-                    <w:right w:type="dxa" w:w="80"/>
-                  </w:tcMar>
-                </w:tcPr>
-                <w:p>
-                  <w:pPr>
-                    <w:spacing w:after="20" w:before="0"/>
-                  </w:pPr>
-                  <w:r>
-                    <w:rPr>
-                      <w:rFonts w:ascii="Arial" w:cs="Arial" w:eastAsia="Arial" w:hAnsi="Arial"/>
-                      <w:b/>
-                      <w:bCs/>
-                      <w:color w:val="0B2A5B"/>
-                      <w:spacing w:val="20"/>
-                      <w:sz w:val="15"/>
-                      <w:szCs w:val="15"/>
-                    </w:rPr>
-                    <w:t xml:space="preserve">ACQUIRE</w:t>
-                  </w:r>
-                </w:p>
-                <w:p>
-                  <w:pPr>
-                    <w:spacing w:after="0" w:before="0"/>
-                  </w:pPr>
-                  <w:r>
-                    <w:rPr>
-                      <w:rFonts w:ascii="Arial" w:cs="Arial" w:eastAsia="Arial" w:hAnsi="Arial"/>
-                      <w:color w:val="1F2933"/>
-                      <w:sz w:val="14"/>
-                      <w:szCs w:val="14"/>
-                    </w:rPr>
-                    <w:t xml:space="preserve">Inbound with HubSpot (Regency Group); ABM for B2B and government accounts (Eurocraft); acquisition strategy for a B2B parts platform</w:t>
-                  </w:r>
-                </w:p>
-              </w:tc>
-              <w:tc>
-                <w:tcPr>
-                  <w:tcW w:type="dxa" w:w="1825"/>
-                  <w:tcBorders>
-                    <w:top w:val="single" w:color="29A8E0" w:sz="18"/>
-                    <w:left w:val="none" w:color="FFFFFF" w:sz="0"/>
-                    <w:bottom w:val="none" w:color="FFFFFF" w:sz="0"/>
-                    <w:right w:val="single" w:color="FFFFFF" w:sz="6"/>
-                  </w:tcBorders>
-                  <w:shd w:fill="F3F3F3" w:color="auto" w:val="clear"/>
-                  <w:tcMar>
-                    <w:top w:type="dxa" w:w="60"/>
-                    <w:left w:type="dxa" w:w="80"/>
-                    <w:bottom w:type="dxa" w:w="60"/>
-                    <w:right w:type="dxa" w:w="80"/>
-                  </w:tcMar>
-                </w:tcPr>
-                <w:p>
-                  <w:pPr>
-                    <w:spacing w:after="20" w:before="0"/>
-                  </w:pPr>
-                  <w:r>
-                    <w:rPr>
-                      <w:rFonts w:ascii="Arial" w:cs="Arial" w:eastAsia="Arial" w:hAnsi="Arial"/>
-                      <w:b/>
-                      <w:bCs/>
-                      <w:color w:val="0B2A5B"/>
-                      <w:spacing w:val="20"/>
-                      <w:sz w:val="15"/>
-                      <w:szCs w:val="15"/>
-                    </w:rPr>
-                    <w:t xml:space="preserve">ACTIVATE</w:t>
-                  </w:r>
-                </w:p>
-                <w:p>
-                  <w:pPr>
-                    <w:spacing w:after="0" w:before="0"/>
-                  </w:pPr>
-                  <w:r>
-                    <w:rPr>
-                      <w:rFonts w:ascii="Arial" w:cs="Arial" w:eastAsia="Arial" w:hAnsi="Arial"/>
-                      <w:color w:val="1F2933"/>
-                      <w:sz w:val="14"/>
-                      <w:szCs w:val="14"/>
-                    </w:rPr>
-                    <w:t xml:space="preserve">Lead → SQL → close and follow-up systems (Regency, Cochlear); e-commerce and online ordering</w:t>
-                  </w:r>
-                </w:p>
-              </w:tc>
-              <w:tc>
-                <w:tcPr>
-                  <w:tcW w:type="dxa" w:w="1825"/>
-                  <w:tcBorders>
-                    <w:top w:val="single" w:color="29A8E0" w:sz="18"/>
-                    <w:left w:val="none" w:color="FFFFFF" w:sz="0"/>
-                    <w:bottom w:val="none" w:color="FFFFFF" w:sz="0"/>
-                    <w:right w:val="single" w:color="FFFFFF" w:sz="6"/>
-                  </w:tcBorders>
-                  <w:shd w:fill="FBFBFB" w:color="auto" w:val="clear"/>
-                  <w:tcMar>
-                    <w:top w:type="dxa" w:w="60"/>
-                    <w:left w:type="dxa" w:w="80"/>
-                    <w:bottom w:type="dxa" w:w="60"/>
-                    <w:right w:type="dxa" w:w="80"/>
-                  </w:tcMar>
-                </w:tcPr>
-                <w:p>
-                  <w:pPr>
-                    <w:spacing w:after="20" w:before="0"/>
-                  </w:pPr>
-                  <w:r>
-                    <w:rPr>
-                      <w:rFonts w:ascii="Arial" w:cs="Arial" w:eastAsia="Arial" w:hAnsi="Arial"/>
-                      <w:b/>
-                      <w:bCs/>
-                      <w:color w:val="0B2A5B"/>
-                      <w:spacing w:val="20"/>
-                      <w:sz w:val="15"/>
-                      <w:szCs w:val="15"/>
-                    </w:rPr>
-                    <w:t xml:space="preserve">RETAIN</w:t>
-                  </w:r>
-                </w:p>
-                <w:p>
-                  <w:pPr>
-                    <w:spacing w:after="0" w:before="0"/>
-                  </w:pPr>
-                  <w:r>
-                    <w:rPr>
-                      <w:rFonts w:ascii="Arial" w:cs="Arial" w:eastAsia="Arial" w:hAnsi="Arial"/>
-                      <w:color w:val="1F2933"/>
-                      <w:sz w:val="14"/>
-                      <w:szCs w:val="14"/>
-                    </w:rPr>
-                    <w:t xml:space="preserve">Loyalty program with 450K+ daily active users; staff trained on loyalty execution</w:t>
-                  </w:r>
-                </w:p>
-              </w:tc>
-              <w:tc>
-                <w:tcPr>
-                  <w:tcW w:type="dxa" w:w="1825"/>
-                  <w:tcBorders>
-                    <w:top w:val="single" w:color="29A8E0" w:sz="18"/>
-                    <w:left w:val="none" w:color="FFFFFF" w:sz="0"/>
-                    <w:bottom w:val="none" w:color="FFFFFF" w:sz="0"/>
-                    <w:right w:val="single" w:color="FFFFFF" w:sz="6"/>
-                  </w:tcBorders>
-                  <w:shd w:fill="F3F3F3" w:color="auto" w:val="clear"/>
-                  <w:tcMar>
-                    <w:top w:type="dxa" w:w="60"/>
-                    <w:left w:type="dxa" w:w="80"/>
-                    <w:bottom w:type="dxa" w:w="60"/>
-                    <w:right w:type="dxa" w:w="80"/>
-                  </w:tcMar>
-                </w:tcPr>
-                <w:p>
-                  <w:pPr>
-                    <w:spacing w:after="20" w:before="0"/>
-                  </w:pPr>
-                  <w:r>
-                    <w:rPr>
-                      <w:rFonts w:ascii="Arial" w:cs="Arial" w:eastAsia="Arial" w:hAnsi="Arial"/>
-                      <w:b/>
-                      <w:bCs/>
-                      <w:color w:val="0B2A5B"/>
-                      <w:spacing w:val="20"/>
-                      <w:sz w:val="15"/>
-                      <w:szCs w:val="15"/>
-                    </w:rPr>
-                    <w:t xml:space="preserve">DEVELOP</w:t>
-                  </w:r>
-                </w:p>
-                <w:p>
-                  <w:pPr>
-                    <w:spacing w:after="0" w:before="0"/>
-                  </w:pPr>
-                  <w:r>
-                    <w:rPr>
-                      <w:rFonts w:ascii="Arial" w:cs="Arial" w:eastAsia="Arial" w:hAnsi="Arial"/>
-                      <w:color w:val="1F2933"/>
-                      <w:sz w:val="14"/>
-                      <w:szCs w:val="14"/>
-                    </w:rPr>
-                    <w:t xml:space="preserve">Webinar pre-sales and online ordering (Under Armour); closing strategy; NPS and brand lift</w:t>
-                  </w:r>
-                </w:p>
-              </w:tc>
-            </w:tr>
-          </w:tbl>
-          <w:p>
-            <w:pPr>
-              <w:spacing w:after="0" w:before="0"/>
-            </w:pPr>
-            <w:r>
-              <w:rPr>
-                <w:rFonts w:ascii="Arial" w:cs="Arial" w:eastAsia="Arial" w:hAnsi="Arial"/>
-                <w:color w:val="1F2933"/>
-                <w:sz w:val="18"/>
-                <w:szCs w:val="18"/>
-              </w:rPr>
-              <w:t xml:space="preserve"/>
             </w:r>
           </w:p>
           <w:p>
@@ -1652,6 +1381,330 @@
                       <w:sz w:val="14"/>
                       <w:szCs w:val="14"/>
                     </w:rPr>
+                    <w:t xml:space="preserve">Under Armour</w:t>
+                  </w:r>
+                  <w:r>
+                    <w:rPr>
+                      <w:rFonts w:ascii="Arial" w:cs="Arial" w:eastAsia="Arial" w:hAnsi="Arial"/>
+                      <w:color w:val="1F2933"/>
+                      <w:sz w:val="14"/>
+                      <w:szCs w:val="14"/>
+                    </w:rPr>
+                    <w:t xml:space="preserve"> — 12-day pre-sales window, one in-person meeting</w:t>
+                  </w:r>
+                </w:p>
+              </w:tc>
+              <w:tc>
+                <w:tcPr>
+                  <w:tcW w:type="dxa" w:w="2800"/>
+                  <w:tcBorders>
+                    <w:top w:val="none" w:color="FFFFFF" w:sz="0"/>
+                    <w:left w:val="none" w:color="FFFFFF" w:sz="0"/>
+                    <w:bottom w:val="single" w:color="E2E2E2" w:sz="4"/>
+                    <w:right w:val="none" w:color="FFFFFF" w:sz="0"/>
+                  </w:tcBorders>
+                  <w:tcMar>
+                    <w:top w:type="dxa" w:w="50"/>
+                    <w:left w:type="dxa" w:w="80"/>
+                    <w:bottom w:type="dxa" w:w="50"/>
+                    <w:right w:type="dxa" w:w="80"/>
+                  </w:tcMar>
+                </w:tcPr>
+                <w:p>
+                  <w:pPr>
+                    <w:spacing w:after="0" w:before="0"/>
+                  </w:pPr>
+                  <w:r>
+                    <w:rPr>
+                      <w:rFonts w:ascii="Arial" w:cs="Arial" w:eastAsia="Arial" w:hAnsi="Arial"/>
+                      <w:color w:val="1F2933"/>
+                      <w:sz w:val="14"/>
+                      <w:szCs w:val="14"/>
+                    </w:rPr>
+                    <w:t xml:space="preserve">Led pre-sales strategy; moved to recurring webinars and an online ordering platform</w:t>
+                  </w:r>
+                </w:p>
+              </w:tc>
+              <w:tc>
+                <w:tcPr>
+                  <w:tcW w:type="dxa" w:w="2500"/>
+                  <w:tcBorders>
+                    <w:top w:val="none" w:color="FFFFFF" w:sz="0"/>
+                    <w:left w:val="none" w:color="FFFFFF" w:sz="0"/>
+                    <w:bottom w:val="single" w:color="E2E2E2" w:sz="4"/>
+                    <w:right w:val="none" w:color="FFFFFF" w:sz="0"/>
+                  </w:tcBorders>
+                  <w:tcMar>
+                    <w:top w:type="dxa" w:w="50"/>
+                    <w:left w:type="dxa" w:w="80"/>
+                    <w:bottom w:type="dxa" w:w="50"/>
+                    <w:right w:type="dxa" w:w="80"/>
+                  </w:tcMar>
+                </w:tcPr>
+                <w:p>
+                  <w:pPr>
+                    <w:spacing w:after="0" w:before="0"/>
+                  </w:pPr>
+                  <w:r>
+                    <w:rPr>
+                      <w:rFonts w:ascii="Arial" w:cs="Arial" w:eastAsia="Arial" w:hAnsi="Arial"/>
+                      <w:b/>
+                      <w:bCs/>
+                      <w:color w:val="0B2A5B"/>
+                      <w:sz w:val="14"/>
+                      <w:szCs w:val="14"/>
+                    </w:rPr>
+                    <w:t xml:space="preserve">Faster purchases; orders up more efficiently</w:t>
+                  </w:r>
+                </w:p>
+              </w:tc>
+            </w:tr>
+            <w:tr>
+              <w:tc>
+                <w:tcPr>
+                  <w:tcW w:type="dxa" w:w="2000"/>
+                  <w:tcBorders>
+                    <w:top w:val="none" w:color="FFFFFF" w:sz="0"/>
+                    <w:left w:val="none" w:color="FFFFFF" w:sz="0"/>
+                    <w:bottom w:val="single" w:color="E2E2E2" w:sz="4"/>
+                    <w:right w:val="none" w:color="FFFFFF" w:sz="0"/>
+                  </w:tcBorders>
+                  <w:tcMar>
+                    <w:top w:type="dxa" w:w="50"/>
+                    <w:left w:type="dxa" w:w="80"/>
+                    <w:bottom w:type="dxa" w:w="50"/>
+                    <w:right w:type="dxa" w:w="80"/>
+                  </w:tcMar>
+                </w:tcPr>
+                <w:p>
+                  <w:pPr>
+                    <w:spacing w:after="0" w:before="0"/>
+                  </w:pPr>
+                  <w:r>
+                    <w:rPr>
+                      <w:rFonts w:ascii="Arial" w:cs="Arial" w:eastAsia="Arial" w:hAnsi="Arial"/>
+                      <w:b/>
+                      <w:bCs/>
+                      <w:color w:val="1A7FC1"/>
+                      <w:sz w:val="14"/>
+                      <w:szCs w:val="14"/>
+                    </w:rPr>
+                    <w:t xml:space="preserve">Prime Group</w:t>
+                  </w:r>
+                  <w:r>
+                    <w:rPr>
+                      <w:rFonts w:ascii="Arial" w:cs="Arial" w:eastAsia="Arial" w:hAnsi="Arial"/>
+                      <w:color w:val="1F2933"/>
+                      <w:sz w:val="14"/>
+                      <w:szCs w:val="14"/>
+                    </w:rPr>
+                    <w:t xml:space="preserve"> — 6 restaurants (Cayman) with no marketing or commercial department</w:t>
+                  </w:r>
+                </w:p>
+              </w:tc>
+              <w:tc>
+                <w:tcPr>
+                  <w:tcW w:type="dxa" w:w="2800"/>
+                  <w:tcBorders>
+                    <w:top w:val="none" w:color="FFFFFF" w:sz="0"/>
+                    <w:left w:val="none" w:color="FFFFFF" w:sz="0"/>
+                    <w:bottom w:val="single" w:color="E2E2E2" w:sz="4"/>
+                    <w:right w:val="none" w:color="FFFFFF" w:sz="0"/>
+                  </w:tcBorders>
+                  <w:tcMar>
+                    <w:top w:type="dxa" w:w="50"/>
+                    <w:left w:type="dxa" w:w="80"/>
+                    <w:bottom w:type="dxa" w:w="50"/>
+                    <w:right w:type="dxa" w:w="80"/>
+                  </w:tcMar>
+                </w:tcPr>
+                <w:p>
+                  <w:pPr>
+                    <w:spacing w:after="0" w:before="0"/>
+                  </w:pPr>
+                  <w:r>
+                    <w:rPr>
+                      <w:rFonts w:ascii="Arial" w:cs="Arial" w:eastAsia="Arial" w:hAnsi="Arial"/>
+                      <w:color w:val="1F2933"/>
+                      <w:sz w:val="14"/>
+                      <w:szCs w:val="14"/>
+                    </w:rPr>
+                    <w:t xml:space="preserve">Built both from scratch; hired and led coordinators and the commercial team; managed budget and P&amp;L</w:t>
+                  </w:r>
+                </w:p>
+              </w:tc>
+              <w:tc>
+                <w:tcPr>
+                  <w:tcW w:type="dxa" w:w="2500"/>
+                  <w:tcBorders>
+                    <w:top w:val="none" w:color="FFFFFF" w:sz="0"/>
+                    <w:left w:val="none" w:color="FFFFFF" w:sz="0"/>
+                    <w:bottom w:val="single" w:color="E2E2E2" w:sz="4"/>
+                    <w:right w:val="none" w:color="FFFFFF" w:sz="0"/>
+                  </w:tcBorders>
+                  <w:tcMar>
+                    <w:top w:type="dxa" w:w="50"/>
+                    <w:left w:type="dxa" w:w="80"/>
+                    <w:bottom w:type="dxa" w:w="50"/>
+                    <w:right w:type="dxa" w:w="80"/>
+                  </w:tcMar>
+                </w:tcPr>
+                <w:p>
+                  <w:pPr>
+                    <w:spacing w:after="0" w:before="0"/>
+                  </w:pPr>
+                  <w:r>
+                    <w:rPr>
+                      <w:rFonts w:ascii="Arial" w:cs="Arial" w:eastAsia="Arial" w:hAnsi="Arial"/>
+                      <w:b/>
+                      <w:bCs/>
+                      <w:color w:val="0B2A5B"/>
+                      <w:sz w:val="14"/>
+                      <w:szCs w:val="14"/>
+                    </w:rPr>
+                    <w:t xml:space="preserve">Engagement +25%; new brand +40% traffic in 3 months</w:t>
+                  </w:r>
+                </w:p>
+              </w:tc>
+            </w:tr>
+            <w:tr>
+              <w:tc>
+                <w:tcPr>
+                  <w:tcW w:type="dxa" w:w="2000"/>
+                  <w:tcBorders>
+                    <w:top w:val="none" w:color="FFFFFF" w:sz="0"/>
+                    <w:left w:val="none" w:color="FFFFFF" w:sz="0"/>
+                    <w:bottom w:val="single" w:color="E2E2E2" w:sz="4"/>
+                    <w:right w:val="none" w:color="FFFFFF" w:sz="0"/>
+                  </w:tcBorders>
+                  <w:tcMar>
+                    <w:top w:type="dxa" w:w="50"/>
+                    <w:left w:type="dxa" w:w="80"/>
+                    <w:bottom w:type="dxa" w:w="50"/>
+                    <w:right w:type="dxa" w:w="80"/>
+                  </w:tcMar>
+                </w:tcPr>
+                <w:p>
+                  <w:pPr>
+                    <w:spacing w:after="0" w:before="0"/>
+                  </w:pPr>
+                  <w:r>
+                    <w:rPr>
+                      <w:rFonts w:ascii="Arial" w:cs="Arial" w:eastAsia="Arial" w:hAnsi="Arial"/>
+                      <w:b/>
+                      <w:bCs/>
+                      <w:color w:val="1A7FC1"/>
+                      <w:sz w:val="14"/>
+                      <w:szCs w:val="14"/>
+                    </w:rPr>
+                    <w:t xml:space="preserve">Toño's Factory</w:t>
+                  </w:r>
+                  <w:r>
+                    <w:rPr>
+                      <w:rFonts w:ascii="Arial" w:cs="Arial" w:eastAsia="Arial" w:hAnsi="Arial"/>
+                      <w:color w:val="1F2933"/>
+                      <w:sz w:val="14"/>
+                      <w:szCs w:val="14"/>
+                    </w:rPr>
+                    <w:t xml:space="preserve"> — new coffee and chocolate experience launching from a blank page</w:t>
+                  </w:r>
+                </w:p>
+              </w:tc>
+              <w:tc>
+                <w:tcPr>
+                  <w:tcW w:type="dxa" w:w="2800"/>
+                  <w:tcBorders>
+                    <w:top w:val="none" w:color="FFFFFF" w:sz="0"/>
+                    <w:left w:val="none" w:color="FFFFFF" w:sz="0"/>
+                    <w:bottom w:val="single" w:color="E2E2E2" w:sz="4"/>
+                    <w:right w:val="none" w:color="FFFFFF" w:sz="0"/>
+                  </w:tcBorders>
+                  <w:tcMar>
+                    <w:top w:type="dxa" w:w="50"/>
+                    <w:left w:type="dxa" w:w="80"/>
+                    <w:bottom w:type="dxa" w:w="50"/>
+                    <w:right w:type="dxa" w:w="80"/>
+                  </w:tcMar>
+                </w:tcPr>
+                <w:p>
+                  <w:pPr>
+                    <w:spacing w:after="0" w:before="0"/>
+                  </w:pPr>
+                  <w:r>
+                    <w:rPr>
+                      <w:rFonts w:ascii="Arial" w:cs="Arial" w:eastAsia="Arial" w:hAnsi="Arial"/>
+                      <w:color w:val="1F2933"/>
+                      <w:sz w:val="14"/>
+                      <w:szCs w:val="14"/>
+                    </w:rPr>
+                    <w:t xml:space="preserve">Led business development and go-to-market: ICPs, brand, website and booking engine, pitch decks for hotels and tour agencies, staff training</w:t>
+                  </w:r>
+                </w:p>
+              </w:tc>
+              <w:tc>
+                <w:tcPr>
+                  <w:tcW w:type="dxa" w:w="2500"/>
+                  <w:tcBorders>
+                    <w:top w:val="none" w:color="FFFFFF" w:sz="0"/>
+                    <w:left w:val="none" w:color="FFFFFF" w:sz="0"/>
+                    <w:bottom w:val="single" w:color="E2E2E2" w:sz="4"/>
+                    <w:right w:val="none" w:color="FFFFFF" w:sz="0"/>
+                  </w:tcBorders>
+                  <w:tcMar>
+                    <w:top w:type="dxa" w:w="50"/>
+                    <w:left w:type="dxa" w:w="80"/>
+                    <w:bottom w:type="dxa" w:w="50"/>
+                    <w:right w:type="dxa" w:w="80"/>
+                  </w:tcMar>
+                </w:tcPr>
+                <w:p>
+                  <w:pPr>
+                    <w:spacing w:after="0" w:before="0"/>
+                  </w:pPr>
+                  <w:r>
+                    <w:rPr>
+                      <w:rFonts w:ascii="Arial" w:cs="Arial" w:eastAsia="Arial" w:hAnsi="Arial"/>
+                      <w:b/>
+                      <w:bCs/>
+                      <w:color w:val="0B2A5B"/>
+                      <w:sz w:val="14"/>
+                      <w:szCs w:val="14"/>
+                    </w:rPr>
+                    <w:t xml:space="preserve">Launched; internal team now runs marketing and B2B sales</w:t>
+                  </w:r>
+                </w:p>
+              </w:tc>
+            </w:tr>
+            <w:tr>
+              <w:tc>
+                <w:tcPr>
+                  <w:tcW w:type="dxa" w:w="2000"/>
+                  <w:tcBorders>
+                    <w:top w:val="none" w:color="FFFFFF" w:sz="0"/>
+                    <w:left w:val="none" w:color="FFFFFF" w:sz="0"/>
+                    <w:bottom w:val="single" w:color="E2E2E2" w:sz="4"/>
+                    <w:right w:val="none" w:color="FFFFFF" w:sz="0"/>
+                  </w:tcBorders>
+                  <w:tcMar>
+                    <w:top w:type="dxa" w:w="50"/>
+                    <w:left w:type="dxa" w:w="80"/>
+                    <w:bottom w:type="dxa" w:w="50"/>
+                    <w:right w:type="dxa" w:w="80"/>
+                  </w:tcMar>
+                </w:tcPr>
+                <w:p>
+                  <w:pPr>
+                    <w:spacing w:after="0" w:before="0"/>
+                  </w:pPr>
+                  <w:r>
+                    <w:rPr>
+                      <w:rFonts w:ascii="Arial" w:cs="Arial" w:eastAsia="Arial" w:hAnsi="Arial"/>
+                      <w:b/>
+                      <w:bCs/>
+                      <w:color w:val="1A7FC1"/>
+                      <w:sz w:val="14"/>
+                      <w:szCs w:val="14"/>
+                    </w:rPr>
                     <w:t xml:space="preserve">Truck-parts distributor</w:t>
                   </w:r>
                   <w:r>
@@ -1726,114 +1779,6 @@
                       <w:szCs w:val="14"/>
                     </w:rPr>
                     <w:t xml:space="preserve">Online ordering, including out-of-stock parts; a hire now runs it</w:t>
-                  </w:r>
-                </w:p>
-              </w:tc>
-            </w:tr>
-            <w:tr>
-              <w:tc>
-                <w:tcPr>
-                  <w:tcW w:type="dxa" w:w="2000"/>
-                  <w:tcBorders>
-                    <w:top w:val="none" w:color="FFFFFF" w:sz="0"/>
-                    <w:left w:val="none" w:color="FFFFFF" w:sz="0"/>
-                    <w:bottom w:val="single" w:color="E2E2E2" w:sz="4"/>
-                    <w:right w:val="none" w:color="FFFFFF" w:sz="0"/>
-                  </w:tcBorders>
-                  <w:tcMar>
-                    <w:top w:type="dxa" w:w="50"/>
-                    <w:left w:type="dxa" w:w="80"/>
-                    <w:bottom w:type="dxa" w:w="50"/>
-                    <w:right w:type="dxa" w:w="80"/>
-                  </w:tcMar>
-                </w:tcPr>
-                <w:p>
-                  <w:pPr>
-                    <w:spacing w:after="0" w:before="0"/>
-                  </w:pPr>
-                  <w:r>
-                    <w:rPr>
-                      <w:rFonts w:ascii="Arial" w:cs="Arial" w:eastAsia="Arial" w:hAnsi="Arial"/>
-                      <w:b/>
-                      <w:bCs/>
-                      <w:color w:val="1A7FC1"/>
-                      <w:sz w:val="14"/>
-                      <w:szCs w:val="14"/>
-                    </w:rPr>
-                    <w:t xml:space="preserve">Under Armour</w:t>
-                  </w:r>
-                  <w:r>
-                    <w:rPr>
-                      <w:rFonts w:ascii="Arial" w:cs="Arial" w:eastAsia="Arial" w:hAnsi="Arial"/>
-                      <w:color w:val="1F2933"/>
-                      <w:sz w:val="14"/>
-                      <w:szCs w:val="14"/>
-                    </w:rPr>
-                    <w:t xml:space="preserve"> — 12-day pre-sales window, one in-person meeting</w:t>
-                  </w:r>
-                </w:p>
-              </w:tc>
-              <w:tc>
-                <w:tcPr>
-                  <w:tcW w:type="dxa" w:w="2800"/>
-                  <w:tcBorders>
-                    <w:top w:val="none" w:color="FFFFFF" w:sz="0"/>
-                    <w:left w:val="none" w:color="FFFFFF" w:sz="0"/>
-                    <w:bottom w:val="single" w:color="E2E2E2" w:sz="4"/>
-                    <w:right w:val="none" w:color="FFFFFF" w:sz="0"/>
-                  </w:tcBorders>
-                  <w:tcMar>
-                    <w:top w:type="dxa" w:w="50"/>
-                    <w:left w:type="dxa" w:w="80"/>
-                    <w:bottom w:type="dxa" w:w="50"/>
-                    <w:right w:type="dxa" w:w="80"/>
-                  </w:tcMar>
-                </w:tcPr>
-                <w:p>
-                  <w:pPr>
-                    <w:spacing w:after="0" w:before="0"/>
-                  </w:pPr>
-                  <w:r>
-                    <w:rPr>
-                      <w:rFonts w:ascii="Arial" w:cs="Arial" w:eastAsia="Arial" w:hAnsi="Arial"/>
-                      <w:color w:val="1F2933"/>
-                      <w:sz w:val="14"/>
-                      <w:szCs w:val="14"/>
-                    </w:rPr>
-                    <w:t xml:space="preserve">Led pre-sales strategy; moved to recurring webinars and an online ordering platform</w:t>
-                  </w:r>
-                </w:p>
-              </w:tc>
-              <w:tc>
-                <w:tcPr>
-                  <w:tcW w:type="dxa" w:w="2500"/>
-                  <w:tcBorders>
-                    <w:top w:val="none" w:color="FFFFFF" w:sz="0"/>
-                    <w:left w:val="none" w:color="FFFFFF" w:sz="0"/>
-                    <w:bottom w:val="single" w:color="E2E2E2" w:sz="4"/>
-                    <w:right w:val="none" w:color="FFFFFF" w:sz="0"/>
-                  </w:tcBorders>
-                  <w:tcMar>
-                    <w:top w:type="dxa" w:w="50"/>
-                    <w:left w:type="dxa" w:w="80"/>
-                    <w:bottom w:type="dxa" w:w="50"/>
-                    <w:right w:type="dxa" w:w="80"/>
-                  </w:tcMar>
-                </w:tcPr>
-                <w:p>
-                  <w:pPr>
-                    <w:spacing w:after="0" w:before="0"/>
-                  </w:pPr>
-                  <w:r>
-                    <w:rPr>
-                      <w:rFonts w:ascii="Arial" w:cs="Arial" w:eastAsia="Arial" w:hAnsi="Arial"/>
-                      <w:b/>
-                      <w:bCs/>
-                      <w:color w:val="0B2A5B"/>
-                      <w:sz w:val="14"/>
-                      <w:szCs w:val="14"/>
-                    </w:rPr>
-                    <w:t xml:space="preserve">Faster purchases; orders up more efficiently</w:t>
                   </w:r>
                 </w:p>
               </w:tc>
@@ -2043,11 +1988,22 @@
       <w:r>
         <w:rPr>
           <w:rFonts w:ascii="Arial" w:cs="Arial" w:eastAsia="Arial" w:hAnsi="Arial"/>
+          <w:b/>
+          <w:bCs/>
           <w:color w:val="1F2933"/>
           <w:sz w:val="18"/>
           <w:szCs w:val="18"/>
         </w:rPr>
-        <w:t xml:space="preserve">Help companies design sales processes that fit how they sell, and implement e-commerce: Shopify stores for footwear and apparel, and a large tailor-made B2B parts platform for LATAM trucks, connected to the client's inventory and warehouse, where workshops and resellers order, including parts not in stock. Defined its acquisition strategy; a dedicated hire now runs it.</w:t>
+        <w:t xml:space="preserve">Toño's Factory (Cayman): </w:t>
+      </w:r>
+      <w:r>
+        <w:rPr>
+          <w:rFonts w:ascii="Arial" w:cs="Arial" w:eastAsia="Arial" w:hAnsi="Arial"/>
+          <w:color w:val="1F2933"/>
+          <w:sz w:val="18"/>
+          <w:szCs w:val="18"/>
+        </w:rPr>
+        <w:t xml:space="preserve">led business development and go-to-market for a coffee and chocolate experience, from kickoff to launch: ICPs, customer journey map, brand identity, website and booking engine, pitch decks for hotels and tour agencies, staff training, PR; handed over to the internal team.</w:t>
       </w:r>
     </w:p>
     <w:p>
@@ -2062,11 +2018,22 @@
       <w:r>
         <w:rPr>
           <w:rFonts w:ascii="Arial" w:cs="Arial" w:eastAsia="Arial" w:hAnsi="Arial"/>
+          <w:b/>
+          <w:bCs/>
           <w:color w:val="1F2933"/>
           <w:sz w:val="18"/>
           <w:szCs w:val="18"/>
         </w:rPr>
-        <w:t xml:space="preserve">Built the marketing + sales strategy and HubSpot inbound system for Regency Group, and trained sellers on structured follow-up by call, email and proposal.</w:t>
+        <w:t xml:space="preserve">Prime Group (6 restaurants, Cayman): </w:t>
+      </w:r>
+      <w:r>
+        <w:rPr>
+          <w:rFonts w:ascii="Arial" w:cs="Arial" w:eastAsia="Arial" w:hAnsi="Arial"/>
+          <w:color w:val="1F2933"/>
+          <w:sz w:val="18"/>
+          <w:szCs w:val="18"/>
+        </w:rPr>
+        <w:t xml:space="preserve">built the marketing and commercial department from scratch, hiring and leading coordinators and the commercial team; managed budgets above USD 500K and the P&amp;L; engagement +25%, new brand +40% traffic in 3 months.</w:t>
       </w:r>
     </w:p>
     <w:p>
@@ -2081,11 +2048,22 @@
       <w:r>
         <w:rPr>
           <w:rFonts w:ascii="Arial" w:cs="Arial" w:eastAsia="Arial" w:hAnsi="Arial"/>
+          <w:b/>
+          <w:bCs/>
           <w:color w:val="1F2933"/>
           <w:sz w:val="18"/>
           <w:szCs w:val="18"/>
         </w:rPr>
-        <w:t xml:space="preserve">Diagnosed the lead → SQL → close path for Cochlear, finding the bottleneck at the concierge role between Marketing and Sales; led consulting sessions and implementation of the changes.</w:t>
+        <w:t xml:space="preserve">Litguide (co-founder, Head of Growth): </w:t>
+      </w:r>
+      <w:r>
+        <w:rPr>
+          <w:rFonts w:ascii="Arial" w:cs="Arial" w:eastAsia="Arial" w:hAnsi="Arial"/>
+          <w:color w:val="1F2933"/>
+          <w:sz w:val="18"/>
+          <w:szCs w:val="18"/>
+        </w:rPr>
+        <w:t xml:space="preserve">led the shift of an e-learning SaaS from B2C to B2B with its own go-to-market for government and education: revenue +100% YoY, acquisition +35%.</w:t>
       </w:r>
     </w:p>
     <w:p>
@@ -2100,11 +2078,22 @@
       <w:r>
         <w:rPr>
           <w:rFonts w:ascii="Arial" w:cs="Arial" w:eastAsia="Arial" w:hAnsi="Arial"/>
+          <w:b/>
+          <w:bCs/>
           <w:color w:val="1F2933"/>
           <w:sz w:val="18"/>
           <w:szCs w:val="18"/>
         </w:rPr>
-        <w:t xml:space="preserve">Executed an ABM strategy for Eurocraft (consultative B2B, government clients), coordinating lead generation with reps in Cayman and Miami: leads +20%, SQLs +15%.</w:t>
+        <w:t xml:space="preserve">Regency Group: </w:t>
+      </w:r>
+      <w:r>
+        <w:rPr>
+          <w:rFonts w:ascii="Arial" w:cs="Arial" w:eastAsia="Arial" w:hAnsi="Arial"/>
+          <w:color w:val="1F2933"/>
+          <w:sz w:val="18"/>
+          <w:szCs w:val="18"/>
+        </w:rPr>
+        <w:t xml:space="preserve">built the marketing + sales strategy and HubSpot inbound system, and trained sellers on structured follow-up by call, email and proposal.</w:t>
       </w:r>
     </w:p>
     <w:p>
@@ -2119,11 +2108,22 @@
       <w:r>
         <w:rPr>
           <w:rFonts w:ascii="Arial" w:cs="Arial" w:eastAsia="Arial" w:hAnsi="Arial"/>
+          <w:b/>
+          <w:bCs/>
           <w:color w:val="1F2933"/>
           <w:sz w:val="18"/>
           <w:szCs w:val="18"/>
         </w:rPr>
-        <w:t xml:space="preserve">Trained sales teams on closing strategy (high-ticket clients); designed service and follow-up processes for hospitality clients, including staff training, loyalty rollout and NPS measurement.</w:t>
+        <w:t xml:space="preserve">Eurocraft: </w:t>
+      </w:r>
+      <w:r>
+        <w:rPr>
+          <w:rFonts w:ascii="Arial" w:cs="Arial" w:eastAsia="Arial" w:hAnsi="Arial"/>
+          <w:color w:val="1F2933"/>
+          <w:sz w:val="18"/>
+          <w:szCs w:val="18"/>
+        </w:rPr>
+        <w:t xml:space="preserve">executed an ABM strategy for a consultative B2B product sold to government clients, coordinating with reps in Cayman and Miami: leads +20%, SQLs +15%.</w:t>
       </w:r>
     </w:p>
     <w:p>
@@ -2138,11 +2138,22 @@
       <w:r>
         <w:rPr>
           <w:rFonts w:ascii="Arial" w:cs="Arial" w:eastAsia="Arial" w:hAnsi="Arial"/>
+          <w:b/>
+          <w:bCs/>
           <w:color w:val="1F2933"/>
           <w:sz w:val="18"/>
           <w:szCs w:val="18"/>
         </w:rPr>
-        <w:t xml:space="preserve">Sell and develop my own consulting business, from lead generation to closing client engagements.</w:t>
+        <w:t xml:space="preserve">Cochlear: </w:t>
+      </w:r>
+      <w:r>
+        <w:rPr>
+          <w:rFonts w:ascii="Arial" w:cs="Arial" w:eastAsia="Arial" w:hAnsi="Arial"/>
+          <w:color w:val="1F2933"/>
+          <w:sz w:val="18"/>
+          <w:szCs w:val="18"/>
+        </w:rPr>
+        <w:t xml:space="preserve">diagnosed the lead → SQL → close path, found the bottleneck at the concierge role between Marketing and Sales, and led consulting sessions and implementation of the changes.</w:t>
       </w:r>
     </w:p>
     <w:p>
@@ -2161,7 +2172,7 @@
           <w:sz w:val="18"/>
           <w:szCs w:val="18"/>
         </w:rPr>
-        <w:t xml:space="preserve">Applied customer segmentation and vertical-specific communication and content strategies across every client engagement.</w:t>
+        <w:t xml:space="preserve">Implement e-commerce: Shopify stores for footwear and apparel, and a tailor-made B2B parts platform for LATAM trucks connected to inventory and warehouse, where workshops and resellers order, including parts not in stock; defined its acquisition strategy.</w:t>
       </w:r>
     </w:p>
     <w:p>
@@ -2180,7 +2191,7 @@
           <w:sz w:val="18"/>
           <w:szCs w:val="18"/>
         </w:rPr>
-        <w:t xml:space="preserve">Run digital brand lift studies; design Go-to-Market strategies (market validation, channel mapping, Joint Plans) for LATAM &amp; Caribbean.</w:t>
+        <w:t xml:space="preserve">Sell and develop my own consulting business; apply customer segmentation and vertical-specific communication and content across engagements; run NPS and brand lift studies and Go-to-Market strategies for LATAM &amp; Caribbean.</w:t>
       </w:r>
     </w:p>
     <w:p>
@@ -2240,7 +2251,7 @@
           <w:sz w:val="18"/>
           <w:szCs w:val="18"/>
         </w:rPr>
-        <w:t xml:space="preserve">Owned sales and market development for the agency: pitched and sold to brands, and opened new client accounts across LATAM.</w:t>
+        <w:t xml:space="preserve">Owned sales and market development for the agency, pitching and opening new client accounts across LATAM for premium consumer, FMCG, financial and B2B brands (KLM-Air France, Under Armour, Mattel, Converse, Varela Hermanos, Banesco, CIFI).</w:t>
       </w:r>
     </w:p>
     <w:p>
@@ -2259,7 +2270,7 @@
           <w:sz w:val="18"/>
           <w:szCs w:val="18"/>
         </w:rPr>
-        <w:t xml:space="preserve">Led a regional growth consultancy for premium consumer, FMCG and B2B brands (KLM-Air France, Under Armour, Mattel, Converse), coordinating distributors and campaigns across markets.</w:t>
+        <w:t xml:space="preserve">Served Under Armour for five years, leading its regional pre-sales strategy for two of them: moved a 12-day in-person process to webinars and an online ordering platform, with Marketing, Sales and Product; trained store teams and key account managers.</w:t>
       </w:r>
     </w:p>
     <w:p>
@@ -2278,7 +2289,48 @@
           <w:sz w:val="18"/>
           <w:szCs w:val="18"/>
         </w:rPr>
-        <w:t xml:space="preserve">Served Under Armour as a client for five years, leading its regional pre-sales strategy for two of them: moved a 12-day in-person process to webinars and an online ordering platform, with Marketing, Sales and Product; trained store teams and key account managers.</w:t>
+        <w:t xml:space="preserve">Managed budgets of USD 500K–1M across clients; accountable for forecast, spend and post-campaign evaluation.</w:t>
+      </w:r>
+    </w:p>
+    <w:p>
+      <w:pPr>
+        <w:keepNext/>
+        <w:tabs>
+          <w:tab w:val="right" w:pos="10800"/>
+        </w:tabs>
+        <w:spacing w:after="50" w:before="120"/>
+      </w:pPr>
+      <w:r>
+        <w:rPr>
+          <w:rFonts w:ascii="Arial" w:cs="Arial" w:eastAsia="Arial" w:hAnsi="Arial"/>
+          <w:b/>
+          <w:bCs/>
+          <w:color w:val="0B2A5B"/>
+          <w:sz w:val="20"/>
+          <w:szCs w:val="20"/>
+        </w:rPr>
+        <w:t xml:space="preserve">Latin3 Digital Agency</w:t>
+      </w:r>
+      <w:r>
+        <w:rPr>
+          <w:rFonts w:ascii="Arial" w:cs="Arial" w:eastAsia="Arial" w:hAnsi="Arial"/>
+          <w:b/>
+          <w:bCs/>
+          <w:color w:val="1A7FC1"/>
+          <w:sz w:val="19"/>
+          <w:szCs w:val="19"/>
+        </w:rPr>
+        <w:t xml:space="preserve">  ·  Managing Partner &amp; Business Development Manager</w:t>
+      </w:r>
+      <w:r>
+        <w:rPr>
+          <w:rFonts w:ascii="Arial" w:cs="Arial" w:eastAsia="Arial" w:hAnsi="Arial"/>
+          <w:color w:val="6B7280"/>
+          <w:sz w:val="16"/>
+          <w:szCs w:val="16"/>
+        </w:rPr>
+        <w:t xml:space="preserve">	</w:t>
+        <w:t xml:space="preserve">2013 – 2016 · Latin America</w:t>
       </w:r>
     </w:p>
     <w:p>
@@ -2297,48 +2349,7 @@
           <w:sz w:val="18"/>
           <w:szCs w:val="18"/>
         </w:rPr>
-        <w:t xml:space="preserve">Managed budgets of USD 500K–1M across clients; accountable for forecast, spend and post-campaign evaluation.</w:t>
-      </w:r>
-    </w:p>
-    <w:p>
-      <w:pPr>
-        <w:keepNext/>
-        <w:tabs>
-          <w:tab w:val="right" w:pos="10800"/>
-        </w:tabs>
-        <w:spacing w:after="50" w:before="120"/>
-      </w:pPr>
-      <w:r>
-        <w:rPr>
-          <w:rFonts w:ascii="Arial" w:cs="Arial" w:eastAsia="Arial" w:hAnsi="Arial"/>
-          <w:b/>
-          <w:bCs/>
-          <w:color w:val="0B2A5B"/>
-          <w:sz w:val="20"/>
-          <w:szCs w:val="20"/>
-        </w:rPr>
-        <w:t xml:space="preserve">Latin3 Digital Agency</w:t>
-      </w:r>
-      <w:r>
-        <w:rPr>
-          <w:rFonts w:ascii="Arial" w:cs="Arial" w:eastAsia="Arial" w:hAnsi="Arial"/>
-          <w:b/>
-          <w:bCs/>
-          <w:color w:val="1A7FC1"/>
-          <w:sz w:val="19"/>
-          <w:szCs w:val="19"/>
-        </w:rPr>
-        <w:t xml:space="preserve">  ·  Managing Partner &amp; Business Development Manager</w:t>
-      </w:r>
-      <w:r>
-        <w:rPr>
-          <w:rFonts w:ascii="Arial" w:cs="Arial" w:eastAsia="Arial" w:hAnsi="Arial"/>
-          <w:color w:val="6B7280"/>
-          <w:sz w:val="16"/>
-          <w:szCs w:val="16"/>
-        </w:rPr>
-        <w:t xml:space="preserve">	</w:t>
-        <w:t xml:space="preserve">2013 – 2016 · Latin America</w:t>
+        <w:t xml:space="preserve">Worked as the agency's salesperson, winning new clients for its portfolio, including the regional Under Armour contract (later continued with 2Brains) and PlayStation for its online game sales launch campaign.</w:t>
       </w:r>
     </w:p>
     <w:p>
@@ -2357,7 +2368,7 @@
           <w:sz w:val="18"/>
           <w:szCs w:val="18"/>
         </w:rPr>
-        <w:t xml:space="preserve">Led commercial strategy and sales for regional operations: developed new markets and sold across LATAM, managing PayPal and Sony accounts.</w:t>
+        <w:t xml:space="preserve">Created and implemented 360° strategies for regional brands, lifting sales 18% YoY; managed digital media of USD 500K–1M for clients such as Coors Light, Dell, Banco General, Varela Hermanos, PayPal and Sony.</w:t>
       </w:r>
     </w:p>
     <w:p>
@@ -2376,7 +2387,7 @@
           <w:sz w:val="18"/>
           <w:szCs w:val="18"/>
         </w:rPr>
-        <w:t xml:space="preserve">Built a loyalty program with 450,000+ daily active users; +30% app downloads, +20% social engagement.</w:t>
+        <w:t xml:space="preserve">Built a digital loyalty program with 450,000+ daily active users; +30% app downloads, +20% social engagement.</w:t>
       </w:r>
     </w:p>
     <w:p>
@@ -2428,7 +2439,7 @@
           <w:sz w:val="19"/>
           <w:szCs w:val="19"/>
         </w:rPr>
-        <w:t xml:space="preserve">  ·  Customer Service &amp; Collections</w:t>
+        <w:t xml:space="preserve">  ·  Customer Service &amp; Credit &amp; Collections Manager</w:t>
       </w:r>
       <w:r>
         <w:rPr>
@@ -2457,7 +2468,7 @@
           <w:sz w:val="18"/>
           <w:szCs w:val="18"/>
         </w:rPr>
-        <w:t xml:space="preserve">Handled B2B customer service and collections in a multinational life-science environment: orders, customer queries and payment follow-up.</w:t>
+        <w:t xml:space="preserve">Promoted from Customer Service Agent to Manager, supervising the Spain and UK markets and managing credit and collections processes in a multinational life-science company.</w:t>
       </w:r>
     </w:p>
     <w:p>
@@ -2498,7 +2509,7 @@
           <w:szCs w:val="16"/>
         </w:rPr>
         <w:t xml:space="preserve">	</w:t>
-        <w:t xml:space="preserve">2008 – 2010 · Argentina / Netherlands</w:t>
+        <w:t xml:space="preserve">2008 – 2010 · Argentina</w:t>
       </w:r>
     </w:p>
     <w:p>
@@ -2517,7 +2528,7 @@
           <w:sz w:val="18"/>
           <w:szCs w:val="18"/>
         </w:rPr>
-        <w:t xml:space="preserve">Joined in product development and, a year later, was hired into business development.</w:t>
+        <w:t xml:space="preserve">Joined in product development of private-label cards for non-financial retail (including CENCOSUD); a year later promoted to business development for private accounts.</w:t>
       </w:r>
     </w:p>
     <w:p>
@@ -2536,7 +2547,48 @@
           <w:sz w:val="18"/>
           <w:szCs w:val="18"/>
         </w:rPr>
-        <w:t xml:space="preserve">Sold card issuing solutions (credit, debit, prepaid) for the Issuing area.</w:t>
+        <w:t xml:space="preserve">Sold card issuing solutions (Issuing) and developed new products and businesses for the CENCOSUD group's business units, as liaison between client stakeholders and internal product, systems and operations teams.</w:t>
+      </w:r>
+    </w:p>
+    <w:p>
+      <w:pPr>
+        <w:keepNext/>
+        <w:tabs>
+          <w:tab w:val="right" w:pos="10800"/>
+        </w:tabs>
+        <w:spacing w:after="50" w:before="120"/>
+      </w:pPr>
+      <w:r>
+        <w:rPr>
+          <w:rFonts w:ascii="Arial" w:cs="Arial" w:eastAsia="Arial" w:hAnsi="Arial"/>
+          <w:b/>
+          <w:bCs/>
+          <w:color w:val="0B2A5B"/>
+          <w:sz w:val="20"/>
+          <w:szCs w:val="20"/>
+        </w:rPr>
+        <w:t xml:space="preserve">IBM Argentina / LATAM</w:t>
+      </w:r>
+      <w:r>
+        <w:rPr>
+          <w:rFonts w:ascii="Arial" w:cs="Arial" w:eastAsia="Arial" w:hAnsi="Arial"/>
+          <w:b/>
+          <w:bCs/>
+          <w:color w:val="1A7FC1"/>
+          <w:sz w:val="19"/>
+          <w:szCs w:val="19"/>
+        </w:rPr>
+        <w:t xml:space="preserve">  ·  Intern → Operations → Sales Executive, SMB Software</w:t>
+      </w:r>
+      <w:r>
+        <w:rPr>
+          <w:rFonts w:ascii="Arial" w:cs="Arial" w:eastAsia="Arial" w:hAnsi="Arial"/>
+          <w:color w:val="6B7280"/>
+          <w:sz w:val="16"/>
+          <w:szCs w:val="16"/>
+        </w:rPr>
+        <w:t xml:space="preserve">	</w:t>
+        <w:t xml:space="preserve">2006 – 2008 · Argentina</w:t>
       </w:r>
     </w:p>
     <w:p>
@@ -2555,48 +2607,7 @@
           <w:sz w:val="18"/>
           <w:szCs w:val="18"/>
         </w:rPr>
-        <w:t xml:space="preserve">Developed new products and businesses for the CENCOSUD group's business units in non-financial retail; liaison between client stakeholders and internal product, systems and operations teams.</w:t>
-      </w:r>
-    </w:p>
-    <w:p>
-      <w:pPr>
-        <w:keepNext/>
-        <w:tabs>
-          <w:tab w:val="right" w:pos="10800"/>
-        </w:tabs>
-        <w:spacing w:after="50" w:before="120"/>
-      </w:pPr>
-      <w:r>
-        <w:rPr>
-          <w:rFonts w:ascii="Arial" w:cs="Arial" w:eastAsia="Arial" w:hAnsi="Arial"/>
-          <w:b/>
-          <w:bCs/>
-          <w:color w:val="0B2A5B"/>
-          <w:sz w:val="20"/>
-          <w:szCs w:val="20"/>
-        </w:rPr>
-        <w:t xml:space="preserve">IBM Argentina / LATAM</w:t>
-      </w:r>
-      <w:r>
-        <w:rPr>
-          <w:rFonts w:ascii="Arial" w:cs="Arial" w:eastAsia="Arial" w:hAnsi="Arial"/>
-          <w:b/>
-          <w:bCs/>
-          <w:color w:val="1A7FC1"/>
-          <w:sz w:val="19"/>
-          <w:szCs w:val="19"/>
-        </w:rPr>
-        <w:t xml:space="preserve">  ·  Intern → Operations → Sales Executive, SMB Software</w:t>
-      </w:r>
-      <w:r>
-        <w:rPr>
-          <w:rFonts w:ascii="Arial" w:cs="Arial" w:eastAsia="Arial" w:hAnsi="Arial"/>
-          <w:color w:val="6B7280"/>
-          <w:sz w:val="16"/>
-          <w:szCs w:val="16"/>
-        </w:rPr>
-        <w:t xml:space="preserve">	</w:t>
-        <w:t xml:space="preserve">2007 – 2008 · Argentina</w:t>
+        <w:t xml:space="preserve">Joined as an intern and grew through the company: operations in the Large Financial Clients cluster, supporting Tier 1 corporate clients, then into sales.</w:t>
       </w:r>
     </w:p>
     <w:p>
@@ -2615,26 +2626,7 @@
           <w:sz w:val="18"/>
           <w:szCs w:val="18"/>
         </w:rPr>
-        <w:t xml:space="preserve">Joined as an intern and grew through the company: operations in the Large Financial Clients cluster, supporting products and services for Tier 1 corporate clients, then into sales.</w:t>
-      </w:r>
-    </w:p>
-    <w:p>
-      <w:pPr>
-        <w:pStyle w:val="ListParagraph"/>
-        <w:numPr>
-          <w:ilvl w:val="0"/>
-          <w:numId w:val="2"/>
-        </w:numPr>
-        <w:spacing w:after="50"/>
-      </w:pPr>
-      <w:r>
-        <w:rPr>
-          <w:rFonts w:ascii="Arial" w:cs="Arial" w:eastAsia="Arial" w:hAnsi="Arial"/>
-          <w:color w:val="1F2933"/>
-          <w:sz w:val="18"/>
-          <w:szCs w:val="18"/>
-        </w:rPr>
-        <w:t xml:space="preserve">Closed in SMB software sales for the Argentine local market, selling to small and mid-sized businesses and contributing to regional pipeline development.</w:t>
+        <w:t xml:space="preserve">Sold software to small and mid-sized businesses in the Argentine market and contributed to regional pipeline development.</w:t>
       </w:r>
     </w:p>
     <w:sectPr>

</xml_diff>

<commit_message>
Update CV (team sizes, less NPS) and add cover letter
Co-Authored-By: Claude Sonnet 5.5 <noreply@anthropic.com>
Claude-Session: https://claude.ai/code/session_012Ed6hShCm7LHKjxkHPPGCy
</commit_message>
<xml_diff>
--- a/CV_Diego_Paolucci_Hilti_EN.docx
+++ b/CV_Diego_Paolucci_Hilti_EN.docx
@@ -1529,7 +1529,7 @@
                       <w:sz w:val="14"/>
                       <w:szCs w:val="14"/>
                     </w:rPr>
-                    <w:t xml:space="preserve">Built both from scratch; hired and led coordinators and the commercial team; managed budget and P&amp;L</w:t>
+                    <w:t xml:space="preserve">Built both from scratch; hired and led a team of 4; managed budget and P&amp;L</w:t>
                   </w:r>
                 </w:p>
               </w:tc>
@@ -2003,7 +2003,7 @@
           <w:sz w:val="18"/>
           <w:szCs w:val="18"/>
         </w:rPr>
-        <w:t xml:space="preserve">led business development and go-to-market for a coffee and chocolate experience, from kickoff to launch: ICPs, customer journey map, brand identity, website and booking engine, pitch decks for hotels and tour agencies, staff training, PR; handed over to the internal team.</w:t>
+        <w:t xml:space="preserve">led business development and go-to-market for a coffee and chocolate experience, from kickoff to launch: ICPs, customer journey map, brand identity, website and booking engine, pitch decks for hotels and tour agencies, staff training, PR, weekly KPI reviews and monthly strategy meetings; handed over to the internal team.</w:t>
       </w:r>
     </w:p>
     <w:p>
@@ -2033,7 +2033,7 @@
           <w:sz w:val="18"/>
           <w:szCs w:val="18"/>
         </w:rPr>
-        <w:t xml:space="preserve">built the marketing and commercial department from scratch, hiring and leading coordinators and the commercial team; managed budgets above USD 500K and the P&amp;L; engagement +25%, new brand +40% traffic in 3 months.</w:t>
+        <w:t xml:space="preserve">built the marketing and commercial department from scratch, hiring and leading a team of 4 (marketing coordinators and the commercial team); managed budgets above USD 500K and the P&amp;L; engagement +25%, new brand +40% traffic in 3 months.</w:t>
       </w:r>
     </w:p>
     <w:p>
@@ -2191,7 +2191,7 @@
           <w:sz w:val="18"/>
           <w:szCs w:val="18"/>
         </w:rPr>
-        <w:t xml:space="preserve">Sell and develop my own consulting business; apply customer segmentation and vertical-specific communication and content across engagements; run NPS and brand lift studies and Go-to-Market strategies for LATAM &amp; Caribbean.</w:t>
+        <w:t xml:space="preserve">Sell and develop my own consulting business; apply customer segmentation and vertical-specific communication and content across every engagement; design Go-to-Market strategies for LATAM &amp; Caribbean; coach and train sellers, store teams and distributors on follow-up and closing.</w:t>
       </w:r>
     </w:p>
     <w:p>
@@ -2468,7 +2468,7 @@
           <w:sz w:val="18"/>
           <w:szCs w:val="18"/>
         </w:rPr>
-        <w:t xml:space="preserve">Promoted from Customer Service Agent to Manager, supervising the Spain and UK markets and managing credit and collections processes in a multinational life-science company.</w:t>
+        <w:t xml:space="preserve">Promoted from Customer Service Agent to Manager, leading a team of 8–12 people across the Spain and UK markets and managing credit and collections processes in a multinational life-science company.</w:t>
       </w:r>
     </w:p>
     <w:p>

</xml_diff>